<commit_message>
Update paper and README citation with official authors: Abdul Rafay Akhtar and Madeeha
</commit_message>
<xml_diff>
--- a/research paper.docx
+++ b/research paper.docx
@@ -30,6 +30,36 @@
           <w:sz w:val="24"/>
         </w:rPr>
         <w:t>A Comprehensive Benchmark Across 33 Open-Source Software Projects (278,563 Issues, 96,750 Traceability Links)</w:t>
+      </w:r>
+    </w:p>
+    <w:p>
+      <w:pPr>
+        <w:spacing w:before="80" w:after="40"/>
+        <w:jc w:val="center"/>
+      </w:pPr>
+      <w:r>
+        <w:rPr>
+          <w:rFonts w:ascii="Calibri" w:hAnsi="Calibri"/>
+          <w:b/>
+          <w:color w:val="1F497D"/>
+          <w:sz w:val="26"/>
+        </w:rPr>
+        <w:t>Abdul Rafay Akhtar and Madeeha</w:t>
+      </w:r>
+    </w:p>
+    <w:p>
+      <w:pPr>
+        <w:spacing w:before="0" w:after="240"/>
+        <w:jc w:val="center"/>
+      </w:pPr>
+      <w:r>
+        <w:rPr>
+          <w:rFonts w:ascii="Calibri" w:hAnsi="Calibri"/>
+          <w:i/>
+          <w:color w:val="666666"/>
+          <w:sz w:val="20"/>
+        </w:rPr>
+        <w:t>Software Engineering Research Repository (2026)</w:t>
       </w:r>
     </w:p>
     <w:tbl>

</xml_diff>